<commit_message>
4 and 5 sis fin
</commit_message>
<xml_diff>
--- a/sis/Laboratornaya rabota N4_.docx
+++ b/sis/Laboratornaya rabota N4_.docx
@@ -4,276 +4,34 @@
   <w:body>
     <w:p>
       <w:pPr>
-        <w:jc w:val="center"/>
+        <w:tabs>
+          <w:tab w:val="left" w:pos="993"/>
+        </w:tabs>
+        <w:spacing w:line="360" w:lineRule="auto"/>
+        <w:ind w:firstLine="709"/>
+        <w:jc w:val="both"/>
         <w:rPr>
           <w:rFonts w:ascii="Times New Roman" w:hAnsi="Times New Roman" w:cs="Times New Roman"/>
           <w:b/>
-          <w:bCs/>
-          <w:sz w:val="24"/>
-          <w:szCs w:val="24"/>
-          <w:lang w:val="en-US"/>
-        </w:rPr>
-      </w:pPr>
-    </w:p>
-    <w:p>
-      <w:pPr>
-        <w:jc w:val="center"/>
+          <w:sz w:val="28"/>
+          <w:szCs w:val="28"/>
+        </w:rPr>
+      </w:pPr>
+      <w:r>
         <w:rPr>
           <w:rFonts w:ascii="Times New Roman" w:hAnsi="Times New Roman" w:cs="Times New Roman"/>
           <w:b/>
-          <w:bCs/>
-          <w:sz w:val="24"/>
-          <w:szCs w:val="24"/>
-        </w:rPr>
-      </w:pPr>
+          <w:sz w:val="28"/>
+          <w:szCs w:val="28"/>
+        </w:rPr>
+        <w:t>Задание для выполнения</w:t>
+      </w:r>
       <w:r>
         <w:rPr>
           <w:rFonts w:ascii="Times New Roman" w:hAnsi="Times New Roman" w:cs="Times New Roman"/>
           <w:b/>
-          <w:bCs/>
-          <w:sz w:val="24"/>
-          <w:szCs w:val="24"/>
-        </w:rPr>
-        <w:t>Лабораторная работа №4</w:t>
-      </w:r>
-    </w:p>
-    <w:p>
-      <w:pPr>
-        <w:jc w:val="center"/>
-        <w:rPr>
-          <w:rFonts w:ascii="Times New Roman" w:hAnsi="Times New Roman" w:cs="Times New Roman"/>
-          <w:b/>
-          <w:bCs/>
-          <w:sz w:val="24"/>
-          <w:szCs w:val="24"/>
-        </w:rPr>
-      </w:pPr>
-      <w:r>
-        <w:rPr>
-          <w:rFonts w:ascii="Times New Roman" w:hAnsi="Times New Roman" w:cs="Times New Roman"/>
-          <w:b/>
-          <w:bCs/>
-          <w:sz w:val="24"/>
-          <w:szCs w:val="24"/>
-        </w:rPr>
-        <w:t xml:space="preserve">«Восстановление носителей информации с помощью бесплатной программы </w:t>
-      </w:r>
-      <w:proofErr w:type="spellStart"/>
-      <w:r>
-        <w:rPr>
-          <w:rFonts w:ascii="Times New Roman" w:hAnsi="Times New Roman" w:cs="Times New Roman"/>
-          <w:b/>
-          <w:bCs/>
-          <w:sz w:val="24"/>
-          <w:szCs w:val="24"/>
-        </w:rPr>
-        <w:t>TestDisk</w:t>
-      </w:r>
-      <w:proofErr w:type="spellEnd"/>
-      <w:r>
-        <w:rPr>
-          <w:rFonts w:ascii="Times New Roman" w:hAnsi="Times New Roman" w:cs="Times New Roman"/>
-          <w:b/>
-          <w:bCs/>
-          <w:sz w:val="24"/>
-          <w:szCs w:val="24"/>
-        </w:rPr>
-        <w:t>»</w:t>
-      </w:r>
-    </w:p>
-    <w:p>
-      <w:pPr>
-        <w:ind w:firstLine="709"/>
-        <w:rPr>
-          <w:rFonts w:ascii="Times New Roman" w:hAnsi="Times New Roman" w:cs="Times New Roman"/>
-          <w:sz w:val="24"/>
-          <w:szCs w:val="24"/>
-        </w:rPr>
-      </w:pPr>
-      <w:r>
-        <w:rPr>
-          <w:rFonts w:ascii="Times New Roman" w:hAnsi="Times New Roman" w:cs="Times New Roman"/>
-          <w:b/>
-          <w:bCs/>
-          <w:sz w:val="24"/>
-          <w:szCs w:val="24"/>
-        </w:rPr>
-        <w:t xml:space="preserve">Цель работы: </w:t>
-      </w:r>
-      <w:r>
-        <w:rPr>
-          <w:rFonts w:ascii="Times New Roman" w:hAnsi="Times New Roman" w:cs="Times New Roman"/>
-          <w:sz w:val="24"/>
-          <w:szCs w:val="24"/>
-        </w:rPr>
-        <w:t xml:space="preserve">Научиться восстанавливать удаленные разделы и поврежденные файловые структуры на внешних и внутренних носителях информации с использованием бесплатного инструмента </w:t>
-      </w:r>
-      <w:proofErr w:type="spellStart"/>
-      <w:r>
-        <w:rPr>
-          <w:rFonts w:ascii="Times New Roman" w:hAnsi="Times New Roman" w:cs="Times New Roman"/>
-          <w:sz w:val="24"/>
-          <w:szCs w:val="24"/>
-        </w:rPr>
-        <w:t>TestDisk</w:t>
-      </w:r>
-      <w:proofErr w:type="spellEnd"/>
-      <w:r>
-        <w:rPr>
-          <w:rFonts w:ascii="Times New Roman" w:hAnsi="Times New Roman" w:cs="Times New Roman"/>
-          <w:sz w:val="24"/>
-          <w:szCs w:val="24"/>
-        </w:rPr>
-        <w:t>.</w:t>
-      </w:r>
-    </w:p>
-    <w:p>
-      <w:pPr>
-        <w:ind w:firstLine="709"/>
-        <w:rPr>
-          <w:rFonts w:ascii="Times New Roman" w:hAnsi="Times New Roman" w:cs="Times New Roman"/>
-          <w:b/>
-          <w:sz w:val="24"/>
-          <w:szCs w:val="24"/>
-        </w:rPr>
-      </w:pPr>
-      <w:r>
-        <w:rPr>
-          <w:rFonts w:ascii="Times New Roman" w:hAnsi="Times New Roman" w:cs="Times New Roman"/>
-          <w:b/>
-          <w:sz w:val="24"/>
-          <w:szCs w:val="24"/>
-        </w:rPr>
-        <w:t>Средства выполнения работы:</w:t>
-      </w:r>
-    </w:p>
-    <w:p>
-      <w:pPr>
-        <w:numPr>
-          <w:ilvl w:val="0"/>
-          <w:numId w:val="4"/>
-        </w:numPr>
-        <w:rPr>
-          <w:rFonts w:ascii="Times New Roman" w:hAnsi="Times New Roman" w:cs="Times New Roman"/>
-          <w:sz w:val="24"/>
-          <w:szCs w:val="24"/>
-        </w:rPr>
-      </w:pPr>
-      <w:r>
-        <w:rPr>
-          <w:rFonts w:ascii="Times New Roman" w:hAnsi="Times New Roman" w:cs="Times New Roman"/>
-          <w:sz w:val="24"/>
-          <w:szCs w:val="24"/>
-        </w:rPr>
-        <w:t>Среда виртуализации VirtualBox.</w:t>
-      </w:r>
-    </w:p>
-    <w:p>
-      <w:pPr>
-        <w:numPr>
-          <w:ilvl w:val="0"/>
-          <w:numId w:val="4"/>
-        </w:numPr>
-        <w:rPr>
-          <w:rFonts w:ascii="Times New Roman" w:hAnsi="Times New Roman" w:cs="Times New Roman"/>
-          <w:sz w:val="24"/>
-          <w:szCs w:val="24"/>
-        </w:rPr>
-      </w:pPr>
-      <w:r>
-        <w:rPr>
-          <w:rFonts w:ascii="Times New Roman" w:hAnsi="Times New Roman" w:cs="Times New Roman"/>
-          <w:sz w:val="24"/>
-          <w:szCs w:val="24"/>
-        </w:rPr>
-        <w:t>Виртуальная машина с установленной Windows 10.</w:t>
-      </w:r>
-    </w:p>
-    <w:p>
-      <w:pPr>
-        <w:numPr>
-          <w:ilvl w:val="0"/>
-          <w:numId w:val="4"/>
-        </w:numPr>
-        <w:rPr>
-          <w:rFonts w:ascii="Times New Roman" w:hAnsi="Times New Roman" w:cs="Times New Roman"/>
-          <w:sz w:val="24"/>
-          <w:szCs w:val="24"/>
-        </w:rPr>
-      </w:pPr>
-      <w:r>
-        <w:rPr>
-          <w:rFonts w:ascii="Times New Roman" w:hAnsi="Times New Roman" w:cs="Times New Roman"/>
-          <w:sz w:val="24"/>
-          <w:szCs w:val="24"/>
-        </w:rPr>
-        <w:t xml:space="preserve">Бесплатная программа </w:t>
-      </w:r>
-      <w:proofErr w:type="spellStart"/>
-      <w:r>
-        <w:rPr>
-          <w:rFonts w:ascii="Times New Roman" w:hAnsi="Times New Roman" w:cs="Times New Roman"/>
-          <w:sz w:val="24"/>
-          <w:szCs w:val="24"/>
-        </w:rPr>
-        <w:t>TestDisk</w:t>
-      </w:r>
-      <w:proofErr w:type="spellEnd"/>
-      <w:r>
-        <w:rPr>
-          <w:rFonts w:ascii="Times New Roman" w:hAnsi="Times New Roman" w:cs="Times New Roman"/>
-          <w:sz w:val="24"/>
-          <w:szCs w:val="24"/>
-        </w:rPr>
-        <w:t xml:space="preserve"> (https://www.cgsecurity.org/).</w:t>
-      </w:r>
-    </w:p>
-    <w:p>
-      <w:pPr>
-        <w:numPr>
-          <w:ilvl w:val="0"/>
-          <w:numId w:val="4"/>
-        </w:numPr>
-        <w:rPr>
-          <w:rFonts w:ascii="Times New Roman" w:hAnsi="Times New Roman" w:cs="Times New Roman"/>
-          <w:sz w:val="24"/>
-          <w:szCs w:val="24"/>
-        </w:rPr>
-      </w:pPr>
-      <w:r>
-        <w:rPr>
-          <w:rFonts w:ascii="Times New Roman" w:hAnsi="Times New Roman" w:cs="Times New Roman"/>
-          <w:sz w:val="24"/>
-          <w:szCs w:val="24"/>
-        </w:rPr>
-        <w:t>Виртуальный или USB-накопитель (можно создать дополнительный виртуальный диск в VirtualBox).</w:t>
-      </w:r>
-    </w:p>
-    <w:p>
-      <w:pPr>
-        <w:ind w:firstLine="709"/>
-        <w:rPr>
-          <w:rFonts w:ascii="Times New Roman" w:hAnsi="Times New Roman" w:cs="Times New Roman"/>
-          <w:b/>
-          <w:sz w:val="24"/>
-          <w:szCs w:val="24"/>
-        </w:rPr>
-      </w:pPr>
-      <w:r>
-        <w:rPr>
-          <w:rFonts w:ascii="Times New Roman" w:hAnsi="Times New Roman" w:cs="Times New Roman"/>
-          <w:b/>
-          <w:sz w:val="24"/>
-          <w:szCs w:val="24"/>
-        </w:rPr>
-        <w:t>Задание для выполнения</w:t>
-      </w:r>
-      <w:r>
-        <w:rPr>
-          <w:rFonts w:ascii="Times New Roman" w:hAnsi="Times New Roman" w:cs="Times New Roman"/>
-          <w:b/>
-          <w:sz w:val="24"/>
-          <w:szCs w:val="24"/>
+          <w:sz w:val="28"/>
+          <w:szCs w:val="28"/>
         </w:rPr>
         <w:t>:</w:t>
       </w:r>
@@ -284,17 +42,23 @@
           <w:ilvl w:val="0"/>
           <w:numId w:val="5"/>
         </w:numPr>
-        <w:rPr>
-          <w:rFonts w:ascii="Times New Roman" w:hAnsi="Times New Roman" w:cs="Times New Roman"/>
-          <w:sz w:val="24"/>
-          <w:szCs w:val="24"/>
-        </w:rPr>
-      </w:pPr>
-      <w:r>
-        <w:rPr>
-          <w:rFonts w:ascii="Times New Roman" w:hAnsi="Times New Roman" w:cs="Times New Roman"/>
-          <w:sz w:val="24"/>
-          <w:szCs w:val="24"/>
+        <w:tabs>
+          <w:tab w:val="left" w:pos="993"/>
+        </w:tabs>
+        <w:spacing w:line="360" w:lineRule="auto"/>
+        <w:ind w:left="0" w:firstLine="709"/>
+        <w:jc w:val="both"/>
+        <w:rPr>
+          <w:rFonts w:ascii="Times New Roman" w:hAnsi="Times New Roman" w:cs="Times New Roman"/>
+          <w:sz w:val="28"/>
+          <w:szCs w:val="28"/>
+        </w:rPr>
+      </w:pPr>
+      <w:r>
+        <w:rPr>
+          <w:rFonts w:ascii="Times New Roman" w:hAnsi="Times New Roman" w:cs="Times New Roman"/>
+          <w:sz w:val="28"/>
+          <w:szCs w:val="28"/>
         </w:rPr>
         <w:t>Подготовьте рабочую среду:</w:t>
       </w:r>
@@ -305,9 +69,36 @@
           <w:ilvl w:val="1"/>
           <w:numId w:val="5"/>
         </w:numPr>
+        <w:tabs>
+          <w:tab w:val="left" w:pos="993"/>
+        </w:tabs>
+        <w:spacing w:line="360" w:lineRule="auto"/>
+        <w:ind w:left="0" w:firstLine="709"/>
         <w:jc w:val="both"/>
         <w:rPr>
           <w:rFonts w:ascii="Times New Roman" w:hAnsi="Times New Roman" w:cs="Times New Roman"/>
+          <w:sz w:val="28"/>
+          <w:szCs w:val="28"/>
+        </w:rPr>
+      </w:pPr>
+      <w:r>
+        <w:rPr>
+          <w:rFonts w:ascii="Times New Roman" w:hAnsi="Times New Roman" w:cs="Times New Roman"/>
+          <w:sz w:val="28"/>
+          <w:szCs w:val="28"/>
+        </w:rPr>
+        <w:t>Запустите виртуальную машину с Windows 10.</w:t>
+      </w:r>
+    </w:p>
+    <w:p>
+      <w:pPr>
+        <w:keepNext/>
+        <w:tabs>
+          <w:tab w:val="left" w:pos="993"/>
+        </w:tabs>
+        <w:spacing w:line="360" w:lineRule="auto"/>
+        <w:jc w:val="center"/>
+        <w:rPr>
           <w:sz w:val="24"/>
           <w:szCs w:val="24"/>
         </w:rPr>
@@ -315,26 +106,9 @@
       <w:r>
         <w:rPr>
           <w:rFonts w:ascii="Times New Roman" w:hAnsi="Times New Roman" w:cs="Times New Roman"/>
-          <w:sz w:val="24"/>
-          <w:szCs w:val="24"/>
-        </w:rPr>
-        <w:t>Запустите виртуальную машину с Windows 10.</w:t>
-      </w:r>
-    </w:p>
-    <w:p>
-      <w:pPr>
-        <w:jc w:val="center"/>
-        <w:rPr>
-          <w:rFonts w:ascii="Times New Roman" w:hAnsi="Times New Roman" w:cs="Times New Roman"/>
-          <w:sz w:val="24"/>
-          <w:szCs w:val="24"/>
-        </w:rPr>
-      </w:pPr>
-      <w:r>
-        <w:rPr>
-          <w:rFonts w:ascii="Times New Roman" w:hAnsi="Times New Roman" w:cs="Times New Roman"/>
-          <w:sz w:val="24"/>
-          <w:szCs w:val="24"/>
+          <w:noProof/>
+          <w:sz w:val="28"/>
+          <w:szCs w:val="28"/>
         </w:rPr>
         <w:drawing>
           <wp:inline distT="0" distB="0" distL="0" distR="0" wp14:anchorId="77862EAA" wp14:editId="7910F4E1">
@@ -375,58 +149,71 @@
     </w:p>
     <w:p>
       <w:pPr>
+        <w:pStyle w:val="ac"/>
+        <w:rPr>
+          <w:smallCaps/>
+          <w:sz w:val="40"/>
+          <w:szCs w:val="40"/>
+          <w:lang w:val="en-US"/>
+        </w:rPr>
+      </w:pPr>
+      <w:r>
+        <w:t xml:space="preserve">Рисунок </w:t>
+      </w:r>
+      <w:fldSimple w:instr=" SEQ Рисунок \* ARABIC ">
+        <w:r>
+          <w:rPr>
+            <w:noProof/>
+          </w:rPr>
+          <w:t>1</w:t>
+        </w:r>
+      </w:fldSimple>
+      <w:r>
+        <w:t>. Запуск ВМ</w:t>
+      </w:r>
+    </w:p>
+    <w:p>
+      <w:pPr>
         <w:numPr>
           <w:ilvl w:val="1"/>
           <w:numId w:val="5"/>
         </w:numPr>
+        <w:tabs>
+          <w:tab w:val="left" w:pos="993"/>
+        </w:tabs>
+        <w:spacing w:line="360" w:lineRule="auto"/>
+        <w:ind w:left="0" w:firstLine="709"/>
         <w:jc w:val="both"/>
         <w:rPr>
           <w:rFonts w:ascii="Times New Roman" w:hAnsi="Times New Roman" w:cs="Times New Roman"/>
-          <w:sz w:val="24"/>
-          <w:szCs w:val="24"/>
-        </w:rPr>
-      </w:pPr>
-      <w:r>
-        <w:rPr>
-          <w:rFonts w:ascii="Times New Roman" w:hAnsi="Times New Roman" w:cs="Times New Roman"/>
-          <w:sz w:val="24"/>
-          <w:szCs w:val="24"/>
-        </w:rPr>
-        <w:t xml:space="preserve">Подключите дополнительный виртуальный диск в </w:t>
-      </w:r>
-      <w:proofErr w:type="spellStart"/>
-      <w:r>
-        <w:rPr>
-          <w:rFonts w:ascii="Times New Roman" w:hAnsi="Times New Roman" w:cs="Times New Roman"/>
-          <w:sz w:val="24"/>
-          <w:szCs w:val="24"/>
-        </w:rPr>
-        <w:t>VirtualBox</w:t>
-      </w:r>
-      <w:proofErr w:type="spellEnd"/>
-      <w:r>
-        <w:rPr>
-          <w:rFonts w:ascii="Times New Roman" w:hAnsi="Times New Roman" w:cs="Times New Roman"/>
-          <w:sz w:val="24"/>
-          <w:szCs w:val="24"/>
-        </w:rPr>
-        <w:t xml:space="preserve"> (или используйте флешку).</w:t>
-      </w:r>
-    </w:p>
-    <w:p>
-      <w:pPr>
+          <w:sz w:val="28"/>
+          <w:szCs w:val="28"/>
+        </w:rPr>
+      </w:pPr>
+      <w:r>
+        <w:rPr>
+          <w:rFonts w:ascii="Times New Roman" w:hAnsi="Times New Roman" w:cs="Times New Roman"/>
+          <w:sz w:val="28"/>
+          <w:szCs w:val="28"/>
+        </w:rPr>
+        <w:t>Подключите дополнительный виртуальный диск в VirtualBox (или используйте флешку).</w:t>
+      </w:r>
+    </w:p>
+    <w:p>
+      <w:pPr>
+        <w:keepNext/>
+        <w:tabs>
+          <w:tab w:val="left" w:pos="993"/>
+        </w:tabs>
+        <w:spacing w:line="360" w:lineRule="auto"/>
         <w:jc w:val="center"/>
-        <w:rPr>
-          <w:rFonts w:ascii="Times New Roman" w:hAnsi="Times New Roman" w:cs="Times New Roman"/>
-          <w:sz w:val="24"/>
-          <w:szCs w:val="24"/>
-        </w:rPr>
-      </w:pPr>
-      <w:r>
-        <w:rPr>
-          <w:rFonts w:ascii="Times New Roman" w:hAnsi="Times New Roman" w:cs="Times New Roman"/>
-          <w:sz w:val="24"/>
-          <w:szCs w:val="24"/>
+      </w:pPr>
+      <w:r>
+        <w:rPr>
+          <w:rFonts w:ascii="Times New Roman" w:hAnsi="Times New Roman" w:cs="Times New Roman"/>
+          <w:noProof/>
+          <w:sz w:val="28"/>
+          <w:szCs w:val="28"/>
         </w:rPr>
         <w:lastRenderedPageBreak/>
         <w:drawing>
@@ -468,41 +255,69 @@
     </w:p>
     <w:p>
       <w:pPr>
+        <w:pStyle w:val="ac"/>
+        <w:rPr>
+          <w:sz w:val="28"/>
+          <w:szCs w:val="28"/>
+        </w:rPr>
+      </w:pPr>
+      <w:r>
+        <w:t xml:space="preserve">Рисунок </w:t>
+      </w:r>
+      <w:fldSimple w:instr=" SEQ Рисунок \* ARABIC ">
+        <w:r>
+          <w:rPr>
+            <w:noProof/>
+          </w:rPr>
+          <w:t>2</w:t>
+        </w:r>
+      </w:fldSimple>
+      <w:r>
+        <w:t>. Создание дополнительного диска</w:t>
+      </w:r>
+    </w:p>
+    <w:p>
+      <w:pPr>
         <w:numPr>
           <w:ilvl w:val="1"/>
           <w:numId w:val="5"/>
         </w:numPr>
+        <w:tabs>
+          <w:tab w:val="left" w:pos="993"/>
+        </w:tabs>
+        <w:spacing w:line="360" w:lineRule="auto"/>
+        <w:ind w:left="0" w:firstLine="709"/>
         <w:jc w:val="both"/>
         <w:rPr>
           <w:rFonts w:ascii="Times New Roman" w:hAnsi="Times New Roman" w:cs="Times New Roman"/>
-          <w:sz w:val="24"/>
-          <w:szCs w:val="24"/>
-        </w:rPr>
-      </w:pPr>
-      <w:r>
-        <w:rPr>
-          <w:rFonts w:ascii="Times New Roman" w:hAnsi="Times New Roman" w:cs="Times New Roman"/>
-          <w:sz w:val="24"/>
-          <w:szCs w:val="24"/>
+          <w:sz w:val="28"/>
+          <w:szCs w:val="28"/>
+        </w:rPr>
+      </w:pPr>
+      <w:r>
+        <w:rPr>
+          <w:rFonts w:ascii="Times New Roman" w:hAnsi="Times New Roman" w:cs="Times New Roman"/>
+          <w:sz w:val="28"/>
+          <w:szCs w:val="28"/>
         </w:rPr>
         <w:t>Отформатируйте диск и создайте на нем несколько файлов разных форматов.</w:t>
       </w:r>
     </w:p>
     <w:p>
       <w:pPr>
+        <w:keepNext/>
+        <w:tabs>
+          <w:tab w:val="left" w:pos="993"/>
+        </w:tabs>
+        <w:spacing w:line="360" w:lineRule="auto"/>
         <w:jc w:val="center"/>
-        <w:rPr>
-          <w:rFonts w:ascii="Times New Roman" w:hAnsi="Times New Roman" w:cs="Times New Roman"/>
-          <w:sz w:val="24"/>
-          <w:szCs w:val="24"/>
-          <w:lang w:val="en-US"/>
-        </w:rPr>
-      </w:pPr>
-      <w:r>
-        <w:rPr>
-          <w:rFonts w:ascii="Times New Roman" w:hAnsi="Times New Roman" w:cs="Times New Roman"/>
-          <w:sz w:val="24"/>
-          <w:szCs w:val="24"/>
+      </w:pPr>
+      <w:r>
+        <w:rPr>
+          <w:rFonts w:ascii="Times New Roman" w:hAnsi="Times New Roman" w:cs="Times New Roman"/>
+          <w:noProof/>
+          <w:sz w:val="28"/>
+          <w:szCs w:val="28"/>
         </w:rPr>
         <w:drawing>
           <wp:inline distT="0" distB="0" distL="0" distR="0" wp14:anchorId="14D96510" wp14:editId="08841AB2">
@@ -543,26 +358,50 @@
     </w:p>
     <w:p>
       <w:pPr>
+        <w:pStyle w:val="ac"/>
+        <w:rPr>
+          <w:sz w:val="28"/>
+          <w:szCs w:val="28"/>
+          <w:lang w:val="en-US"/>
+        </w:rPr>
+      </w:pPr>
+      <w:r>
+        <w:t xml:space="preserve">Рисунок </w:t>
+      </w:r>
+      <w:fldSimple w:instr=" SEQ Рисунок \* ARABIC ">
+        <w:r>
+          <w:rPr>
+            <w:noProof/>
+          </w:rPr>
+          <w:t>3</w:t>
+        </w:r>
+      </w:fldSimple>
+      <w:r>
+        <w:t>. Управление дисками</w:t>
+      </w:r>
+    </w:p>
+    <w:p>
+      <w:pPr>
+        <w:keepNext/>
+        <w:tabs>
+          <w:tab w:val="left" w:pos="993"/>
+        </w:tabs>
+        <w:spacing w:line="360" w:lineRule="auto"/>
         <w:jc w:val="center"/>
-        <w:rPr>
-          <w:rFonts w:ascii="Times New Roman" w:hAnsi="Times New Roman" w:cs="Times New Roman"/>
-          <w:sz w:val="24"/>
-          <w:szCs w:val="24"/>
-          <w:lang w:val="en-US"/>
-        </w:rPr>
-      </w:pPr>
-      <w:r>
-        <w:rPr>
-          <w:rFonts w:ascii="Times New Roman" w:hAnsi="Times New Roman" w:cs="Times New Roman"/>
-          <w:sz w:val="24"/>
-          <w:szCs w:val="24"/>
+      </w:pPr>
+      <w:r>
+        <w:rPr>
+          <w:rFonts w:ascii="Times New Roman" w:hAnsi="Times New Roman" w:cs="Times New Roman"/>
+          <w:noProof/>
+          <w:sz w:val="28"/>
+          <w:szCs w:val="28"/>
           <w:lang w:val="en-US"/>
         </w:rPr>
         <w:lastRenderedPageBreak/>
         <w:drawing>
-          <wp:inline distT="0" distB="0" distL="0" distR="0" wp14:anchorId="1D1FCAA3" wp14:editId="0F4DBC96">
-            <wp:extent cx="5940425" cy="4474210"/>
-            <wp:effectExtent l="0" t="0" r="3175" b="2540"/>
+          <wp:inline distT="0" distB="0" distL="0" distR="0" wp14:anchorId="1D1FCAA3" wp14:editId="06896C5E">
+            <wp:extent cx="5169148" cy="3893299"/>
+            <wp:effectExtent l="0" t="0" r="0" b="0"/>
             <wp:docPr id="1319247473" name="Рисунок 1" descr="Изображение выглядит как текст, снимок экрана, программное обеспечение, Значок на компьютере&#10;&#10;Содержимое, созданное искусственным интеллектом, может быть неверным."/>
             <wp:cNvGraphicFramePr>
               <a:graphicFrameLocks xmlns:a="http://schemas.openxmlformats.org/drawingml/2006/main" noChangeAspect="1"/>
@@ -583,7 +422,7 @@
                   <pic:spPr>
                     <a:xfrm>
                       <a:off x="0" y="0"/>
-                      <a:ext cx="5940425" cy="4474210"/>
+                      <a:ext cx="5173871" cy="3896856"/>
                     </a:xfrm>
                     <a:prstGeom prst="rect">
                       <a:avLst/>
@@ -598,22 +437,50 @@
     </w:p>
     <w:p>
       <w:pPr>
+        <w:pStyle w:val="ac"/>
+        <w:rPr>
+          <w:sz w:val="28"/>
+          <w:szCs w:val="28"/>
+        </w:rPr>
+      </w:pPr>
+      <w:r>
+        <w:t xml:space="preserve">Рисунок </w:t>
+      </w:r>
+      <w:fldSimple w:instr=" SEQ Рисунок \* ARABIC ">
+        <w:r>
+          <w:rPr>
+            <w:noProof/>
+          </w:rPr>
+          <w:t>4</w:t>
+        </w:r>
+      </w:fldSimple>
+      <w:r>
+        <w:t>. Создание файлов на новом диске</w:t>
+      </w:r>
+    </w:p>
+    <w:p>
+      <w:pPr>
         <w:numPr>
           <w:ilvl w:val="0"/>
           <w:numId w:val="5"/>
         </w:numPr>
+        <w:tabs>
+          <w:tab w:val="left" w:pos="993"/>
+        </w:tabs>
+        <w:spacing w:line="360" w:lineRule="auto"/>
+        <w:ind w:left="0" w:firstLine="709"/>
         <w:jc w:val="both"/>
         <w:rPr>
           <w:rFonts w:ascii="Times New Roman" w:hAnsi="Times New Roman" w:cs="Times New Roman"/>
-          <w:sz w:val="24"/>
-          <w:szCs w:val="24"/>
-        </w:rPr>
-      </w:pPr>
-      <w:r>
-        <w:rPr>
-          <w:rFonts w:ascii="Times New Roman" w:hAnsi="Times New Roman" w:cs="Times New Roman"/>
-          <w:sz w:val="24"/>
-          <w:szCs w:val="24"/>
+          <w:sz w:val="28"/>
+          <w:szCs w:val="28"/>
+        </w:rPr>
+      </w:pPr>
+      <w:r>
+        <w:rPr>
+          <w:rFonts w:ascii="Times New Roman" w:hAnsi="Times New Roman" w:cs="Times New Roman"/>
+          <w:sz w:val="28"/>
+          <w:szCs w:val="28"/>
         </w:rPr>
         <w:t>Имитируйте потерю данных:</w:t>
       </w:r>
@@ -624,60 +491,48 @@
           <w:ilvl w:val="1"/>
           <w:numId w:val="5"/>
         </w:numPr>
+        <w:tabs>
+          <w:tab w:val="left" w:pos="993"/>
+        </w:tabs>
+        <w:spacing w:line="360" w:lineRule="auto"/>
+        <w:ind w:left="0" w:firstLine="709"/>
         <w:jc w:val="both"/>
         <w:rPr>
           <w:rFonts w:ascii="Times New Roman" w:hAnsi="Times New Roman" w:cs="Times New Roman"/>
-          <w:sz w:val="24"/>
-          <w:szCs w:val="24"/>
-        </w:rPr>
-      </w:pPr>
-      <w:r>
-        <w:rPr>
-          <w:rFonts w:ascii="Times New Roman" w:hAnsi="Times New Roman" w:cs="Times New Roman"/>
-          <w:sz w:val="24"/>
-          <w:szCs w:val="24"/>
-        </w:rPr>
-        <w:t xml:space="preserve">Удалите раздел с подключенного диска через "Управление дисками" или с помощью </w:t>
-      </w:r>
-      <w:proofErr w:type="spellStart"/>
-      <w:r>
-        <w:rPr>
-          <w:rFonts w:ascii="Times New Roman" w:hAnsi="Times New Roman" w:cs="Times New Roman"/>
-          <w:sz w:val="24"/>
-          <w:szCs w:val="24"/>
-        </w:rPr>
-        <w:t>diskpart</w:t>
-      </w:r>
-      <w:proofErr w:type="spellEnd"/>
-      <w:r>
-        <w:rPr>
-          <w:rFonts w:ascii="Times New Roman" w:hAnsi="Times New Roman" w:cs="Times New Roman"/>
-          <w:sz w:val="24"/>
-          <w:szCs w:val="24"/>
-        </w:rPr>
-        <w:t>.</w:t>
-      </w:r>
-    </w:p>
-    <w:p>
-      <w:pPr>
-        <w:jc w:val="both"/>
-        <w:rPr>
-          <w:rFonts w:ascii="Times New Roman" w:hAnsi="Times New Roman" w:cs="Times New Roman"/>
-          <w:sz w:val="24"/>
-          <w:szCs w:val="24"/>
-        </w:rPr>
-      </w:pPr>
-      <w:r>
-        <w:rPr>
-          <w:rFonts w:ascii="Times New Roman" w:hAnsi="Times New Roman" w:cs="Times New Roman"/>
-          <w:sz w:val="24"/>
-          <w:szCs w:val="24"/>
+          <w:sz w:val="28"/>
+          <w:szCs w:val="28"/>
+        </w:rPr>
+      </w:pPr>
+      <w:r>
+        <w:rPr>
+          <w:rFonts w:ascii="Times New Roman" w:hAnsi="Times New Roman" w:cs="Times New Roman"/>
+          <w:sz w:val="28"/>
+          <w:szCs w:val="28"/>
+        </w:rPr>
+        <w:t>Удалите раздел с подключенного диска через "Управление дисками" или с помощью diskpart.</w:t>
+      </w:r>
+    </w:p>
+    <w:p>
+      <w:pPr>
+        <w:keepNext/>
+        <w:tabs>
+          <w:tab w:val="left" w:pos="993"/>
+        </w:tabs>
+        <w:spacing w:line="360" w:lineRule="auto"/>
+        <w:jc w:val="center"/>
+      </w:pPr>
+      <w:r>
+        <w:rPr>
+          <w:rFonts w:ascii="Times New Roman" w:hAnsi="Times New Roman" w:cs="Times New Roman"/>
+          <w:noProof/>
+          <w:sz w:val="28"/>
+          <w:szCs w:val="28"/>
         </w:rPr>
         <w:lastRenderedPageBreak/>
         <w:drawing>
-          <wp:inline distT="0" distB="0" distL="0" distR="0" wp14:anchorId="158A9857" wp14:editId="1EC7B2F3">
-            <wp:extent cx="5940425" cy="4540250"/>
-            <wp:effectExtent l="0" t="0" r="3175" b="0"/>
+          <wp:inline distT="0" distB="0" distL="0" distR="0" wp14:anchorId="158A9857" wp14:editId="31BE9B17">
+            <wp:extent cx="4890852" cy="3738064"/>
+            <wp:effectExtent l="0" t="0" r="5080" b="0"/>
             <wp:docPr id="1082632584" name="Рисунок 1" descr="Изображение выглядит как текст, электроника, снимок экрана, дисплей&#10;&#10;Содержимое, созданное искусственным интеллектом, может быть неверным."/>
             <wp:cNvGraphicFramePr>
               <a:graphicFrameLocks xmlns:a="http://schemas.openxmlformats.org/drawingml/2006/main" noChangeAspect="1"/>
@@ -698,7 +553,7 @@
                   <pic:spPr>
                     <a:xfrm>
                       <a:off x="0" y="0"/>
-                      <a:ext cx="5940425" cy="4540250"/>
+                      <a:ext cx="4896869" cy="3742663"/>
                     </a:xfrm>
                     <a:prstGeom prst="rect">
                       <a:avLst/>
@@ -713,47 +568,74 @@
     </w:p>
     <w:p>
       <w:pPr>
+        <w:pStyle w:val="ac"/>
+        <w:rPr>
+          <w:sz w:val="28"/>
+          <w:szCs w:val="28"/>
+        </w:rPr>
+      </w:pPr>
+      <w:r>
+        <w:t xml:space="preserve">Рисунок </w:t>
+      </w:r>
+      <w:fldSimple w:instr=" SEQ Рисунок \* ARABIC ">
+        <w:r>
+          <w:rPr>
+            <w:noProof/>
+          </w:rPr>
+          <w:t>5</w:t>
+        </w:r>
+      </w:fldSimple>
+      <w:r>
+        <w:t>. Удаление тома</w:t>
+      </w:r>
+    </w:p>
+    <w:p>
+      <w:pPr>
         <w:numPr>
           <w:ilvl w:val="1"/>
           <w:numId w:val="5"/>
         </w:numPr>
+        <w:tabs>
+          <w:tab w:val="left" w:pos="993"/>
+        </w:tabs>
+        <w:spacing w:line="360" w:lineRule="auto"/>
+        <w:ind w:left="0" w:firstLine="709"/>
         <w:jc w:val="both"/>
         <w:rPr>
           <w:rFonts w:ascii="Times New Roman" w:hAnsi="Times New Roman" w:cs="Times New Roman"/>
-          <w:sz w:val="24"/>
-          <w:szCs w:val="24"/>
-        </w:rPr>
-      </w:pPr>
-      <w:r>
-        <w:rPr>
-          <w:rFonts w:ascii="Times New Roman" w:hAnsi="Times New Roman" w:cs="Times New Roman"/>
-          <w:sz w:val="24"/>
-          <w:szCs w:val="24"/>
+          <w:sz w:val="28"/>
+          <w:szCs w:val="28"/>
+        </w:rPr>
+      </w:pPr>
+      <w:r>
+        <w:rPr>
+          <w:rFonts w:ascii="Times New Roman" w:hAnsi="Times New Roman" w:cs="Times New Roman"/>
+          <w:sz w:val="28"/>
+          <w:szCs w:val="28"/>
         </w:rPr>
         <w:t>Убедитесь, что диск стал "Не распределен" или недоступен в проводнике.</w:t>
       </w:r>
     </w:p>
     <w:p>
       <w:pPr>
-        <w:ind w:left="1440"/>
-        <w:jc w:val="both"/>
-        <w:rPr>
-          <w:rFonts w:ascii="Times New Roman" w:hAnsi="Times New Roman" w:cs="Times New Roman"/>
-          <w:sz w:val="24"/>
-          <w:szCs w:val="24"/>
-        </w:rPr>
-      </w:pPr>
-      <w:r>
-        <w:rPr>
-          <w:rFonts w:ascii="Times New Roman" w:hAnsi="Times New Roman" w:cs="Times New Roman"/>
-          <w:sz w:val="24"/>
-          <w:szCs w:val="24"/>
-        </w:rPr>
-        <w:lastRenderedPageBreak/>
+        <w:keepNext/>
+        <w:tabs>
+          <w:tab w:val="left" w:pos="993"/>
+        </w:tabs>
+        <w:spacing w:line="360" w:lineRule="auto"/>
+        <w:jc w:val="center"/>
+      </w:pPr>
+      <w:r>
+        <w:rPr>
+          <w:rFonts w:ascii="Times New Roman" w:hAnsi="Times New Roman" w:cs="Times New Roman"/>
+          <w:noProof/>
+          <w:sz w:val="28"/>
+          <w:szCs w:val="28"/>
+        </w:rPr>
         <w:drawing>
-          <wp:inline distT="0" distB="0" distL="0" distR="0" wp14:anchorId="3C22E5C5" wp14:editId="1B79F9ED">
-            <wp:extent cx="5940425" cy="4502785"/>
-            <wp:effectExtent l="0" t="0" r="3175" b="0"/>
+          <wp:inline distT="0" distB="0" distL="0" distR="0" wp14:anchorId="3C22E5C5" wp14:editId="2CCFFE01">
+            <wp:extent cx="5073732" cy="3845840"/>
+            <wp:effectExtent l="0" t="0" r="0" b="2540"/>
             <wp:docPr id="1883730125" name="Рисунок 1" descr="Изображение выглядит как текст, снимок экрана, дисплей, программное обеспечение&#10;&#10;Содержимое, созданное искусственным интеллектом, может быть неверным."/>
             <wp:cNvGraphicFramePr>
               <a:graphicFrameLocks xmlns:a="http://schemas.openxmlformats.org/drawingml/2006/main" noChangeAspect="1"/>
@@ -774,7 +656,7 @@
                   <pic:spPr>
                     <a:xfrm>
                       <a:off x="0" y="0"/>
-                      <a:ext cx="5940425" cy="4502785"/>
+                      <a:ext cx="5077785" cy="3848912"/>
                     </a:xfrm>
                     <a:prstGeom prst="rect">
                       <a:avLst/>
@@ -789,42 +671,53 @@
     </w:p>
     <w:p>
       <w:pPr>
+        <w:pStyle w:val="ac"/>
+        <w:rPr>
+          <w:sz w:val="28"/>
+          <w:szCs w:val="28"/>
+        </w:rPr>
+      </w:pPr>
+      <w:r>
+        <w:t xml:space="preserve">Рисунок </w:t>
+      </w:r>
+      <w:fldSimple w:instr=" SEQ Рисунок \* ARABIC ">
+        <w:r>
+          <w:rPr>
+            <w:noProof/>
+          </w:rPr>
+          <w:t>6</w:t>
+        </w:r>
+      </w:fldSimple>
+      <w:r>
+        <w:t>. Диск «не распределен»</w:t>
+      </w:r>
+    </w:p>
+    <w:p>
+      <w:pPr>
         <w:numPr>
           <w:ilvl w:val="0"/>
           <w:numId w:val="5"/>
         </w:numPr>
+        <w:tabs>
+          <w:tab w:val="left" w:pos="993"/>
+        </w:tabs>
+        <w:spacing w:line="360" w:lineRule="auto"/>
+        <w:ind w:left="0" w:firstLine="709"/>
         <w:jc w:val="both"/>
         <w:rPr>
           <w:rFonts w:ascii="Times New Roman" w:hAnsi="Times New Roman" w:cs="Times New Roman"/>
-          <w:sz w:val="24"/>
-          <w:szCs w:val="24"/>
-        </w:rPr>
-      </w:pPr>
-      <w:r>
-        <w:rPr>
-          <w:rFonts w:ascii="Times New Roman" w:hAnsi="Times New Roman" w:cs="Times New Roman"/>
-          <w:sz w:val="24"/>
-          <w:szCs w:val="24"/>
-        </w:rPr>
-        <w:t xml:space="preserve">Установите и запустите программу </w:t>
-      </w:r>
-      <w:proofErr w:type="spellStart"/>
-      <w:r>
-        <w:rPr>
-          <w:rFonts w:ascii="Times New Roman" w:hAnsi="Times New Roman" w:cs="Times New Roman"/>
-          <w:sz w:val="24"/>
-          <w:szCs w:val="24"/>
-        </w:rPr>
-        <w:t>TestDisk</w:t>
-      </w:r>
-      <w:proofErr w:type="spellEnd"/>
-      <w:r>
-        <w:rPr>
-          <w:rFonts w:ascii="Times New Roman" w:hAnsi="Times New Roman" w:cs="Times New Roman"/>
-          <w:sz w:val="24"/>
-          <w:szCs w:val="24"/>
-        </w:rPr>
-        <w:t>:</w:t>
+          <w:sz w:val="28"/>
+          <w:szCs w:val="28"/>
+        </w:rPr>
+      </w:pPr>
+      <w:r>
+        <w:rPr>
+          <w:rFonts w:ascii="Times New Roman" w:hAnsi="Times New Roman" w:cs="Times New Roman"/>
+          <w:sz w:val="28"/>
+          <w:szCs w:val="28"/>
+        </w:rPr>
+        <w:lastRenderedPageBreak/>
+        <w:t>Установите и запустите программу TestDisk:</w:t>
       </w:r>
     </w:p>
     <w:p>
@@ -833,62 +726,49 @@
           <w:ilvl w:val="1"/>
           <w:numId w:val="5"/>
         </w:numPr>
+        <w:tabs>
+          <w:tab w:val="left" w:pos="993"/>
+        </w:tabs>
+        <w:spacing w:line="360" w:lineRule="auto"/>
+        <w:ind w:left="0" w:firstLine="709"/>
         <w:jc w:val="both"/>
         <w:rPr>
           <w:rFonts w:ascii="Times New Roman" w:hAnsi="Times New Roman" w:cs="Times New Roman"/>
-          <w:sz w:val="24"/>
-          <w:szCs w:val="24"/>
-        </w:rPr>
-      </w:pPr>
-      <w:r>
-        <w:rPr>
-          <w:rFonts w:ascii="Times New Roman" w:hAnsi="Times New Roman" w:cs="Times New Roman"/>
-          <w:sz w:val="24"/>
-          <w:szCs w:val="24"/>
-        </w:rPr>
-        <w:t xml:space="preserve">Скачайте </w:t>
-      </w:r>
-      <w:proofErr w:type="spellStart"/>
-      <w:r>
-        <w:rPr>
-          <w:rFonts w:ascii="Times New Roman" w:hAnsi="Times New Roman" w:cs="Times New Roman"/>
-          <w:sz w:val="24"/>
-          <w:szCs w:val="24"/>
-        </w:rPr>
-        <w:t>TestDisk</w:t>
-      </w:r>
-      <w:proofErr w:type="spellEnd"/>
-      <w:r>
-        <w:rPr>
-          <w:rFonts w:ascii="Times New Roman" w:hAnsi="Times New Roman" w:cs="Times New Roman"/>
-          <w:sz w:val="24"/>
-          <w:szCs w:val="24"/>
-        </w:rPr>
-        <w:t xml:space="preserve"> с официального сайта и распакуйте архив.</w:t>
-      </w:r>
-    </w:p>
-    <w:p>
-      <w:pPr>
-        <w:ind w:left="1440"/>
-        <w:jc w:val="both"/>
-        <w:rPr>
-          <w:rFonts w:ascii="Times New Roman" w:hAnsi="Times New Roman" w:cs="Times New Roman"/>
-          <w:sz w:val="24"/>
-          <w:szCs w:val="24"/>
-        </w:rPr>
+          <w:sz w:val="28"/>
+          <w:szCs w:val="28"/>
+        </w:rPr>
+      </w:pPr>
+      <w:r>
+        <w:rPr>
+          <w:rFonts w:ascii="Times New Roman" w:hAnsi="Times New Roman" w:cs="Times New Roman"/>
+          <w:sz w:val="28"/>
+          <w:szCs w:val="28"/>
+        </w:rPr>
+        <w:t>Скачайте TestDisk с официального сайта и распакуйте архив.</w:t>
+      </w:r>
+    </w:p>
+    <w:p>
+      <w:pPr>
+        <w:keepNext/>
+        <w:tabs>
+          <w:tab w:val="left" w:pos="993"/>
+        </w:tabs>
+        <w:spacing w:line="360" w:lineRule="auto"/>
+        <w:jc w:val="center"/>
       </w:pPr>
       <w:r>
         <w:rPr>
           <w:rFonts w:ascii="Times New Roman" w:hAnsi="Times New Roman" w:cs="Times New Roman"/>
           <w:b/>
           <w:bCs/>
-          <w:sz w:val="24"/>
-          <w:szCs w:val="24"/>
+          <w:noProof/>
+          <w:sz w:val="28"/>
+          <w:szCs w:val="28"/>
         </w:rPr>
         <w:drawing>
-          <wp:inline distT="0" distB="0" distL="0" distR="0" wp14:anchorId="761B1398" wp14:editId="1DF375EC">
-            <wp:extent cx="5940425" cy="3404235"/>
-            <wp:effectExtent l="0" t="0" r="3175" b="5715"/>
+          <wp:inline distT="0" distB="0" distL="0" distR="0" wp14:anchorId="761B1398" wp14:editId="14B0AF07">
+            <wp:extent cx="5367931" cy="3076160"/>
+            <wp:effectExtent l="0" t="0" r="4445" b="0"/>
             <wp:docPr id="1448637822" name="Рисунок 1" descr="Изображение выглядит как текст, снимок экрана, программное обеспечение, Значок на компьютере&#10;&#10;Содержимое, созданное искусственным интеллектом, может быть неверным."/>
             <wp:cNvGraphicFramePr>
               <a:graphicFrameLocks xmlns:a="http://schemas.openxmlformats.org/drawingml/2006/main" noChangeAspect="1"/>
@@ -909,7 +789,7 @@
                   <pic:spPr>
                     <a:xfrm>
                       <a:off x="0" y="0"/>
-                      <a:ext cx="5940425" cy="3404235"/>
+                      <a:ext cx="5371126" cy="3077991"/>
                     </a:xfrm>
                     <a:prstGeom prst="rect">
                       <a:avLst/>
@@ -924,47 +804,80 @@
     </w:p>
     <w:p>
       <w:pPr>
+        <w:pStyle w:val="ac"/>
+        <w:rPr>
+          <w:sz w:val="28"/>
+          <w:szCs w:val="28"/>
+        </w:rPr>
+      </w:pPr>
+      <w:r>
+        <w:t xml:space="preserve">Рисунок </w:t>
+      </w:r>
+      <w:fldSimple w:instr=" SEQ Рисунок \* ARABIC ">
+        <w:r>
+          <w:rPr>
+            <w:noProof/>
+          </w:rPr>
+          <w:t>7</w:t>
+        </w:r>
+      </w:fldSimple>
+      <w:r>
+        <w:t xml:space="preserve">. Архив программы </w:t>
+      </w:r>
+      <w:r>
+        <w:rPr>
+          <w:lang w:val="en-US"/>
+        </w:rPr>
+        <w:t>TestDisk</w:t>
+      </w:r>
+    </w:p>
+    <w:p>
+      <w:pPr>
         <w:numPr>
           <w:ilvl w:val="1"/>
           <w:numId w:val="5"/>
         </w:numPr>
+        <w:tabs>
+          <w:tab w:val="left" w:pos="993"/>
+        </w:tabs>
+        <w:spacing w:line="360" w:lineRule="auto"/>
+        <w:ind w:left="0" w:firstLine="709"/>
         <w:jc w:val="both"/>
         <w:rPr>
           <w:rFonts w:ascii="Times New Roman" w:hAnsi="Times New Roman" w:cs="Times New Roman"/>
-          <w:sz w:val="24"/>
-          <w:szCs w:val="24"/>
-        </w:rPr>
-      </w:pPr>
-      <w:r>
-        <w:rPr>
-          <w:rFonts w:ascii="Times New Roman" w:hAnsi="Times New Roman" w:cs="Times New Roman"/>
-          <w:sz w:val="24"/>
-          <w:szCs w:val="24"/>
+          <w:sz w:val="28"/>
+          <w:szCs w:val="28"/>
+        </w:rPr>
+      </w:pPr>
+      <w:r>
+        <w:rPr>
+          <w:rFonts w:ascii="Times New Roman" w:hAnsi="Times New Roman" w:cs="Times New Roman"/>
+          <w:sz w:val="28"/>
+          <w:szCs w:val="28"/>
         </w:rPr>
         <w:t>Запустите файл testdisk_win.exe от имени администратора (интерфейс текстовый).</w:t>
       </w:r>
     </w:p>
     <w:p>
       <w:pPr>
-        <w:ind w:left="1080"/>
-        <w:jc w:val="both"/>
-        <w:rPr>
-          <w:rFonts w:ascii="Times New Roman" w:hAnsi="Times New Roman" w:cs="Times New Roman"/>
-          <w:sz w:val="24"/>
-          <w:szCs w:val="24"/>
-        </w:rPr>
-      </w:pPr>
-      <w:r>
-        <w:rPr>
-          <w:rFonts w:ascii="Times New Roman" w:hAnsi="Times New Roman" w:cs="Times New Roman"/>
-          <w:sz w:val="24"/>
-          <w:szCs w:val="24"/>
-        </w:rPr>
-        <w:lastRenderedPageBreak/>
+        <w:keepNext/>
+        <w:tabs>
+          <w:tab w:val="left" w:pos="993"/>
+        </w:tabs>
+        <w:spacing w:line="360" w:lineRule="auto"/>
+        <w:jc w:val="center"/>
+      </w:pPr>
+      <w:r>
+        <w:rPr>
+          <w:rFonts w:ascii="Times New Roman" w:hAnsi="Times New Roman" w:cs="Times New Roman"/>
+          <w:noProof/>
+          <w:sz w:val="28"/>
+          <w:szCs w:val="28"/>
+        </w:rPr>
         <w:drawing>
-          <wp:inline distT="0" distB="0" distL="0" distR="0" wp14:anchorId="78D9F776" wp14:editId="1BFD5715">
-            <wp:extent cx="4372585" cy="3353268"/>
-            <wp:effectExtent l="0" t="0" r="9525" b="0"/>
+          <wp:inline distT="0" distB="0" distL="0" distR="0" wp14:anchorId="78D9F776" wp14:editId="61D3C2EA">
+            <wp:extent cx="3966459" cy="3041816"/>
+            <wp:effectExtent l="0" t="0" r="0" b="6350"/>
             <wp:docPr id="1208235537" name="Рисунок 1" descr="Изображение выглядит как текст, снимок экрана, электроника, дисплей&#10;&#10;Содержимое, созданное искусственным интеллектом, может быть неверным."/>
             <wp:cNvGraphicFramePr>
               <a:graphicFrameLocks xmlns:a="http://schemas.openxmlformats.org/drawingml/2006/main" noChangeAspect="1"/>
@@ -985,7 +898,7 @@
                   <pic:spPr>
                     <a:xfrm>
                       <a:off x="0" y="0"/>
-                      <a:ext cx="4372585" cy="3353268"/>
+                      <a:ext cx="3969012" cy="3043774"/>
                     </a:xfrm>
                     <a:prstGeom prst="rect">
                       <a:avLst/>
@@ -1000,22 +913,50 @@
     </w:p>
     <w:p>
       <w:pPr>
+        <w:pStyle w:val="ac"/>
+        <w:rPr>
+          <w:sz w:val="28"/>
+          <w:szCs w:val="28"/>
+        </w:rPr>
+      </w:pPr>
+      <w:r>
+        <w:t xml:space="preserve">Рисунок </w:t>
+      </w:r>
+      <w:fldSimple w:instr=" SEQ Рисунок \* ARABIC ">
+        <w:r>
+          <w:rPr>
+            <w:noProof/>
+          </w:rPr>
+          <w:t>8</w:t>
+        </w:r>
+      </w:fldSimple>
+      <w:r>
+        <w:t>. Запуск от имени администратора</w:t>
+      </w:r>
+    </w:p>
+    <w:p>
+      <w:pPr>
         <w:numPr>
           <w:ilvl w:val="0"/>
           <w:numId w:val="5"/>
         </w:numPr>
+        <w:tabs>
+          <w:tab w:val="left" w:pos="993"/>
+        </w:tabs>
+        <w:spacing w:line="360" w:lineRule="auto"/>
+        <w:ind w:left="0" w:firstLine="709"/>
         <w:jc w:val="both"/>
         <w:rPr>
           <w:rFonts w:ascii="Times New Roman" w:hAnsi="Times New Roman" w:cs="Times New Roman"/>
-          <w:sz w:val="24"/>
-          <w:szCs w:val="24"/>
-        </w:rPr>
-      </w:pPr>
-      <w:r>
-        <w:rPr>
-          <w:rFonts w:ascii="Times New Roman" w:hAnsi="Times New Roman" w:cs="Times New Roman"/>
-          <w:sz w:val="24"/>
-          <w:szCs w:val="24"/>
+          <w:sz w:val="28"/>
+          <w:szCs w:val="28"/>
+        </w:rPr>
+      </w:pPr>
+      <w:r>
+        <w:rPr>
+          <w:rFonts w:ascii="Times New Roman" w:hAnsi="Times New Roman" w:cs="Times New Roman"/>
+          <w:sz w:val="28"/>
+          <w:szCs w:val="28"/>
         </w:rPr>
         <w:t>Выполните восстановление раздела:</w:t>
       </w:r>
@@ -1026,60 +967,48 @@
           <w:ilvl w:val="1"/>
           <w:numId w:val="5"/>
         </w:numPr>
+        <w:tabs>
+          <w:tab w:val="left" w:pos="993"/>
+        </w:tabs>
+        <w:spacing w:line="360" w:lineRule="auto"/>
+        <w:ind w:left="0" w:firstLine="709"/>
         <w:jc w:val="both"/>
         <w:rPr>
           <w:rFonts w:ascii="Times New Roman" w:hAnsi="Times New Roman" w:cs="Times New Roman"/>
-          <w:sz w:val="24"/>
-          <w:szCs w:val="24"/>
-        </w:rPr>
-      </w:pPr>
-      <w:r>
-        <w:rPr>
-          <w:rFonts w:ascii="Times New Roman" w:hAnsi="Times New Roman" w:cs="Times New Roman"/>
-          <w:sz w:val="24"/>
-          <w:szCs w:val="24"/>
-        </w:rPr>
-        <w:t>Выберите "</w:t>
-      </w:r>
-      <w:proofErr w:type="spellStart"/>
-      <w:r>
-        <w:rPr>
-          <w:rFonts w:ascii="Times New Roman" w:hAnsi="Times New Roman" w:cs="Times New Roman"/>
-          <w:sz w:val="24"/>
-          <w:szCs w:val="24"/>
-        </w:rPr>
-        <w:t>Create</w:t>
-      </w:r>
-      <w:proofErr w:type="spellEnd"/>
-      <w:r>
-        <w:rPr>
-          <w:rFonts w:ascii="Times New Roman" w:hAnsi="Times New Roman" w:cs="Times New Roman"/>
-          <w:sz w:val="24"/>
-          <w:szCs w:val="24"/>
-        </w:rPr>
-        <w:t>" для создания нового лог-файла.</w:t>
-      </w:r>
-    </w:p>
-    <w:p>
-      <w:pPr>
-        <w:ind w:left="1440"/>
-        <w:jc w:val="both"/>
-        <w:rPr>
-          <w:rFonts w:ascii="Times New Roman" w:hAnsi="Times New Roman" w:cs="Times New Roman"/>
-          <w:sz w:val="24"/>
-          <w:szCs w:val="24"/>
-        </w:rPr>
-      </w:pPr>
-      <w:r>
-        <w:rPr>
-          <w:rFonts w:ascii="Times New Roman" w:hAnsi="Times New Roman" w:cs="Times New Roman"/>
-          <w:sz w:val="24"/>
-          <w:szCs w:val="24"/>
+          <w:sz w:val="28"/>
+          <w:szCs w:val="28"/>
+        </w:rPr>
+      </w:pPr>
+      <w:r>
+        <w:rPr>
+          <w:rFonts w:ascii="Times New Roman" w:hAnsi="Times New Roman" w:cs="Times New Roman"/>
+          <w:sz w:val="28"/>
+          <w:szCs w:val="28"/>
+        </w:rPr>
+        <w:lastRenderedPageBreak/>
+        <w:t>Выберите "Create" для создания нового лог-файла.</w:t>
+      </w:r>
+    </w:p>
+    <w:p>
+      <w:pPr>
+        <w:keepNext/>
+        <w:tabs>
+          <w:tab w:val="left" w:pos="993"/>
+        </w:tabs>
+        <w:spacing w:line="360" w:lineRule="auto"/>
+        <w:jc w:val="center"/>
+      </w:pPr>
+      <w:r>
+        <w:rPr>
+          <w:rFonts w:ascii="Times New Roman" w:hAnsi="Times New Roman" w:cs="Times New Roman"/>
+          <w:noProof/>
+          <w:sz w:val="28"/>
+          <w:szCs w:val="28"/>
         </w:rPr>
         <w:drawing>
-          <wp:inline distT="0" distB="0" distL="0" distR="0" wp14:anchorId="3DB9A443" wp14:editId="65902412">
-            <wp:extent cx="5940425" cy="3104515"/>
-            <wp:effectExtent l="0" t="0" r="3175" b="635"/>
+          <wp:inline distT="0" distB="0" distL="0" distR="0" wp14:anchorId="3DB9A443" wp14:editId="029DA4A5">
+            <wp:extent cx="5018073" cy="2622486"/>
+            <wp:effectExtent l="0" t="0" r="0" b="6985"/>
             <wp:docPr id="473124858" name="Рисунок 1" descr="Изображение выглядит как текст, снимок экрана, программное обеспечение, компьютер&#10;&#10;Содержимое, созданное искусственным интеллектом, может быть неверным."/>
             <wp:cNvGraphicFramePr>
               <a:graphicFrameLocks xmlns:a="http://schemas.openxmlformats.org/drawingml/2006/main" noChangeAspect="1"/>
@@ -1100,7 +1029,7 @@
                   <pic:spPr>
                     <a:xfrm>
                       <a:off x="0" y="0"/>
-                      <a:ext cx="5940425" cy="3104515"/>
+                      <a:ext cx="5031459" cy="2629482"/>
                     </a:xfrm>
                     <a:prstGeom prst="rect">
                       <a:avLst/>
@@ -1115,47 +1044,83 @@
     </w:p>
     <w:p>
       <w:pPr>
+        <w:pStyle w:val="ac"/>
+        <w:rPr>
+          <w:sz w:val="28"/>
+          <w:szCs w:val="28"/>
+        </w:rPr>
+      </w:pPr>
+      <w:r>
+        <w:t xml:space="preserve">Рисунок </w:t>
+      </w:r>
+      <w:fldSimple w:instr=" SEQ Рисунок \* ARABIC ">
+        <w:r>
+          <w:rPr>
+            <w:noProof/>
+          </w:rPr>
+          <w:t>9</w:t>
+        </w:r>
+      </w:fldSimple>
+      <w:r>
+        <w:t>. С</w:t>
+      </w:r>
+      <w:r>
+        <w:t>оздани</w:t>
+      </w:r>
+      <w:r>
+        <w:t>е</w:t>
+      </w:r>
+      <w:r>
+        <w:t xml:space="preserve"> нового лог-файла</w:t>
+      </w:r>
+    </w:p>
+    <w:p>
+      <w:pPr>
         <w:numPr>
           <w:ilvl w:val="1"/>
           <w:numId w:val="5"/>
         </w:numPr>
+        <w:tabs>
+          <w:tab w:val="left" w:pos="993"/>
+        </w:tabs>
+        <w:spacing w:line="360" w:lineRule="auto"/>
+        <w:ind w:left="0" w:firstLine="709"/>
         <w:jc w:val="both"/>
         <w:rPr>
           <w:rFonts w:ascii="Times New Roman" w:hAnsi="Times New Roman" w:cs="Times New Roman"/>
-          <w:sz w:val="24"/>
-          <w:szCs w:val="24"/>
-        </w:rPr>
-      </w:pPr>
-      <w:r>
-        <w:rPr>
-          <w:rFonts w:ascii="Times New Roman" w:hAnsi="Times New Roman" w:cs="Times New Roman"/>
-          <w:sz w:val="24"/>
-          <w:szCs w:val="24"/>
+          <w:sz w:val="28"/>
+          <w:szCs w:val="28"/>
+        </w:rPr>
+      </w:pPr>
+      <w:r>
+        <w:rPr>
+          <w:rFonts w:ascii="Times New Roman" w:hAnsi="Times New Roman" w:cs="Times New Roman"/>
+          <w:sz w:val="28"/>
+          <w:szCs w:val="28"/>
         </w:rPr>
         <w:t>Укажите диск, с которого был удален раздел.</w:t>
       </w:r>
     </w:p>
     <w:p>
       <w:pPr>
-        <w:ind w:left="1440"/>
-        <w:jc w:val="both"/>
-        <w:rPr>
-          <w:rFonts w:ascii="Times New Roman" w:hAnsi="Times New Roman" w:cs="Times New Roman"/>
-          <w:sz w:val="24"/>
-          <w:szCs w:val="24"/>
-        </w:rPr>
-      </w:pPr>
-      <w:r>
-        <w:rPr>
-          <w:rFonts w:ascii="Times New Roman" w:hAnsi="Times New Roman" w:cs="Times New Roman"/>
-          <w:sz w:val="24"/>
-          <w:szCs w:val="24"/>
-        </w:rPr>
-        <w:lastRenderedPageBreak/>
+        <w:keepNext/>
+        <w:tabs>
+          <w:tab w:val="left" w:pos="993"/>
+        </w:tabs>
+        <w:spacing w:line="360" w:lineRule="auto"/>
+        <w:jc w:val="center"/>
+      </w:pPr>
+      <w:r>
+        <w:rPr>
+          <w:rFonts w:ascii="Times New Roman" w:hAnsi="Times New Roman" w:cs="Times New Roman"/>
+          <w:noProof/>
+          <w:sz w:val="28"/>
+          <w:szCs w:val="28"/>
+        </w:rPr>
         <w:drawing>
-          <wp:inline distT="0" distB="0" distL="0" distR="0" wp14:anchorId="15BDA352" wp14:editId="0898A4BC">
-            <wp:extent cx="5940425" cy="3107055"/>
-            <wp:effectExtent l="0" t="0" r="3175" b="0"/>
+          <wp:inline distT="0" distB="0" distL="0" distR="0" wp14:anchorId="15BDA352" wp14:editId="28CC3533">
+            <wp:extent cx="5177099" cy="2707808"/>
+            <wp:effectExtent l="0" t="0" r="5080" b="0"/>
             <wp:docPr id="832754985" name="Рисунок 1" descr="Изображение выглядит как текст, снимок экрана, программное обеспечение, Мультимедийное программное обеспечение&#10;&#10;Содержимое, созданное искусственным интеллектом, может быть неверным."/>
             <wp:cNvGraphicFramePr>
               <a:graphicFrameLocks xmlns:a="http://schemas.openxmlformats.org/drawingml/2006/main" noChangeAspect="1"/>
@@ -1176,7 +1141,7 @@
                   <pic:spPr>
                     <a:xfrm>
                       <a:off x="0" y="0"/>
-                      <a:ext cx="5940425" cy="3107055"/>
+                      <a:ext cx="5181784" cy="2710258"/>
                     </a:xfrm>
                     <a:prstGeom prst="rect">
                       <a:avLst/>
@@ -1191,46 +1156,75 @@
     </w:p>
     <w:p>
       <w:pPr>
+        <w:pStyle w:val="ac"/>
+        <w:rPr>
+          <w:sz w:val="28"/>
+          <w:szCs w:val="28"/>
+        </w:rPr>
+      </w:pPr>
+      <w:r>
+        <w:t xml:space="preserve">Рисунок </w:t>
+      </w:r>
+      <w:fldSimple w:instr=" SEQ Рисунок \* ARABIC ">
+        <w:r>
+          <w:rPr>
+            <w:noProof/>
+          </w:rPr>
+          <w:t>10</w:t>
+        </w:r>
+      </w:fldSimple>
+      <w:r>
+        <w:t>. Указание диска</w:t>
+      </w:r>
+    </w:p>
+    <w:p>
+      <w:pPr>
         <w:numPr>
           <w:ilvl w:val="1"/>
           <w:numId w:val="5"/>
         </w:numPr>
+        <w:tabs>
+          <w:tab w:val="left" w:pos="993"/>
+        </w:tabs>
+        <w:spacing w:line="360" w:lineRule="auto"/>
+        <w:ind w:left="0" w:firstLine="709"/>
         <w:jc w:val="both"/>
         <w:rPr>
           <w:rFonts w:ascii="Times New Roman" w:hAnsi="Times New Roman" w:cs="Times New Roman"/>
-          <w:sz w:val="24"/>
-          <w:szCs w:val="24"/>
-        </w:rPr>
-      </w:pPr>
-      <w:r>
-        <w:rPr>
-          <w:rFonts w:ascii="Times New Roman" w:hAnsi="Times New Roman" w:cs="Times New Roman"/>
-          <w:sz w:val="24"/>
-          <w:szCs w:val="24"/>
+          <w:sz w:val="28"/>
+          <w:szCs w:val="28"/>
+        </w:rPr>
+      </w:pPr>
+      <w:r>
+        <w:rPr>
+          <w:rFonts w:ascii="Times New Roman" w:hAnsi="Times New Roman" w:cs="Times New Roman"/>
+          <w:sz w:val="28"/>
+          <w:szCs w:val="28"/>
         </w:rPr>
         <w:t>Выберите тип таблицы разделов (обычно Intel/PC).</w:t>
       </w:r>
     </w:p>
     <w:p>
       <w:pPr>
-        <w:ind w:left="1440"/>
-        <w:jc w:val="both"/>
-        <w:rPr>
-          <w:rFonts w:ascii="Times New Roman" w:hAnsi="Times New Roman" w:cs="Times New Roman"/>
-          <w:sz w:val="24"/>
-          <w:szCs w:val="24"/>
-        </w:rPr>
-      </w:pPr>
-      <w:r>
-        <w:rPr>
-          <w:rFonts w:ascii="Times New Roman" w:hAnsi="Times New Roman" w:cs="Times New Roman"/>
-          <w:sz w:val="24"/>
-          <w:szCs w:val="24"/>
-        </w:rPr>
+        <w:keepNext/>
+        <w:tabs>
+          <w:tab w:val="left" w:pos="993"/>
+        </w:tabs>
+        <w:spacing w:line="360" w:lineRule="auto"/>
+        <w:jc w:val="center"/>
+      </w:pPr>
+      <w:r>
+        <w:rPr>
+          <w:rFonts w:ascii="Times New Roman" w:hAnsi="Times New Roman" w:cs="Times New Roman"/>
+          <w:noProof/>
+          <w:sz w:val="28"/>
+          <w:szCs w:val="28"/>
+        </w:rPr>
+        <w:lastRenderedPageBreak/>
         <w:drawing>
-          <wp:inline distT="0" distB="0" distL="0" distR="0" wp14:anchorId="7DC0683E" wp14:editId="602A1294">
-            <wp:extent cx="5940425" cy="3116580"/>
-            <wp:effectExtent l="0" t="0" r="3175" b="7620"/>
+          <wp:inline distT="0" distB="0" distL="0" distR="0" wp14:anchorId="7DC0683E" wp14:editId="0DB22ECF">
+            <wp:extent cx="5352028" cy="2807884"/>
+            <wp:effectExtent l="0" t="0" r="1270" b="0"/>
             <wp:docPr id="715140616" name="Рисунок 1" descr="Изображение выглядит как текст, снимок экрана, программное обеспечение, компьютер&#10;&#10;Содержимое, созданное искусственным интеллектом, может быть неверным."/>
             <wp:cNvGraphicFramePr>
               <a:graphicFrameLocks xmlns:a="http://schemas.openxmlformats.org/drawingml/2006/main" noChangeAspect="1"/>
@@ -1251,7 +1245,7 @@
                   <pic:spPr>
                     <a:xfrm>
                       <a:off x="0" y="0"/>
-                      <a:ext cx="5940425" cy="3116580"/>
+                      <a:ext cx="5361728" cy="2812973"/>
                     </a:xfrm>
                     <a:prstGeom prst="rect">
                       <a:avLst/>
@@ -1266,66 +1260,74 @@
     </w:p>
     <w:p>
       <w:pPr>
+        <w:pStyle w:val="ac"/>
+        <w:rPr>
+          <w:sz w:val="28"/>
+          <w:szCs w:val="28"/>
+        </w:rPr>
+      </w:pPr>
+      <w:r>
+        <w:t xml:space="preserve">Рисунок </w:t>
+      </w:r>
+      <w:fldSimple w:instr=" SEQ Рисунок \* ARABIC ">
+        <w:r>
+          <w:rPr>
+            <w:noProof/>
+          </w:rPr>
+          <w:t>11</w:t>
+        </w:r>
+      </w:fldSimple>
+      <w:r>
+        <w:t>. Выбор типа таблиц</w:t>
+      </w:r>
+    </w:p>
+    <w:p>
+      <w:pPr>
         <w:numPr>
           <w:ilvl w:val="1"/>
           <w:numId w:val="5"/>
         </w:numPr>
+        <w:tabs>
+          <w:tab w:val="left" w:pos="993"/>
+        </w:tabs>
+        <w:spacing w:line="360" w:lineRule="auto"/>
+        <w:ind w:left="0" w:firstLine="709"/>
         <w:jc w:val="both"/>
         <w:rPr>
           <w:rFonts w:ascii="Times New Roman" w:hAnsi="Times New Roman" w:cs="Times New Roman"/>
-          <w:sz w:val="24"/>
-          <w:szCs w:val="24"/>
-        </w:rPr>
-      </w:pPr>
-      <w:r>
-        <w:rPr>
-          <w:rFonts w:ascii="Times New Roman" w:hAnsi="Times New Roman" w:cs="Times New Roman"/>
-          <w:sz w:val="24"/>
-          <w:szCs w:val="24"/>
-        </w:rPr>
-        <w:t>Выберите "</w:t>
-      </w:r>
-      <w:proofErr w:type="spellStart"/>
-      <w:r>
-        <w:rPr>
-          <w:rFonts w:ascii="Times New Roman" w:hAnsi="Times New Roman" w:cs="Times New Roman"/>
-          <w:sz w:val="24"/>
-          <w:szCs w:val="24"/>
-        </w:rPr>
-        <w:t>Analyse</w:t>
-      </w:r>
-      <w:proofErr w:type="spellEnd"/>
-      <w:r>
-        <w:rPr>
-          <w:rFonts w:ascii="Times New Roman" w:hAnsi="Times New Roman" w:cs="Times New Roman"/>
-          <w:sz w:val="24"/>
-          <w:szCs w:val="24"/>
-        </w:rPr>
-        <w:t>" → "Quick Search", дождитесь окончания поиска.</w:t>
-      </w:r>
-    </w:p>
-    <w:p>
-      <w:pPr>
-        <w:ind w:left="1440"/>
-        <w:jc w:val="both"/>
-        <w:rPr>
-          <w:rFonts w:ascii="Times New Roman" w:hAnsi="Times New Roman" w:cs="Times New Roman"/>
-          <w:sz w:val="24"/>
-          <w:szCs w:val="24"/>
-          <w:lang w:val="en-US"/>
-        </w:rPr>
-      </w:pPr>
-      <w:r>
-        <w:rPr>
-          <w:rFonts w:ascii="Times New Roman" w:hAnsi="Times New Roman" w:cs="Times New Roman"/>
-          <w:sz w:val="24"/>
-          <w:szCs w:val="24"/>
-        </w:rPr>
-        <w:lastRenderedPageBreak/>
+          <w:sz w:val="28"/>
+          <w:szCs w:val="28"/>
+        </w:rPr>
+      </w:pPr>
+      <w:r>
+        <w:rPr>
+          <w:rFonts w:ascii="Times New Roman" w:hAnsi="Times New Roman" w:cs="Times New Roman"/>
+          <w:sz w:val="28"/>
+          <w:szCs w:val="28"/>
+        </w:rPr>
+        <w:t>Выберите "Analyse" → "Quick Search", дождитесь окончания поиска.</w:t>
+      </w:r>
+    </w:p>
+    <w:p>
+      <w:pPr>
+        <w:keepNext/>
+        <w:tabs>
+          <w:tab w:val="left" w:pos="993"/>
+        </w:tabs>
+        <w:spacing w:line="360" w:lineRule="auto"/>
+        <w:jc w:val="center"/>
+      </w:pPr>
+      <w:r>
+        <w:rPr>
+          <w:rFonts w:ascii="Times New Roman" w:hAnsi="Times New Roman" w:cs="Times New Roman"/>
+          <w:noProof/>
+          <w:sz w:val="28"/>
+          <w:szCs w:val="28"/>
+        </w:rPr>
         <w:drawing>
-          <wp:inline distT="0" distB="0" distL="0" distR="0" wp14:anchorId="4263B07E" wp14:editId="4F96E71F">
-            <wp:extent cx="5940425" cy="3091815"/>
-            <wp:effectExtent l="0" t="0" r="3175" b="0"/>
+          <wp:inline distT="0" distB="0" distL="0" distR="0" wp14:anchorId="4263B07E" wp14:editId="3CD611B7">
+            <wp:extent cx="5431541" cy="2826956"/>
+            <wp:effectExtent l="0" t="0" r="0" b="0"/>
             <wp:docPr id="2141486585" name="Рисунок 1" descr="Изображение выглядит как текст, снимок экрана, программное обеспечение, компьютер&#10;&#10;Содержимое, созданное искусственным интеллектом, может быть неверным."/>
             <wp:cNvGraphicFramePr>
               <a:graphicFrameLocks xmlns:a="http://schemas.openxmlformats.org/drawingml/2006/main" noChangeAspect="1"/>
@@ -1346,7 +1348,7 @@
                   <pic:spPr>
                     <a:xfrm>
                       <a:off x="0" y="0"/>
-                      <a:ext cx="5940425" cy="3091815"/>
+                      <a:ext cx="5435673" cy="2829106"/>
                     </a:xfrm>
                     <a:prstGeom prst="rect">
                       <a:avLst/>
@@ -1361,26 +1363,50 @@
     </w:p>
     <w:p>
       <w:pPr>
-        <w:ind w:left="1440"/>
-        <w:jc w:val="both"/>
-        <w:rPr>
-          <w:rFonts w:ascii="Times New Roman" w:hAnsi="Times New Roman" w:cs="Times New Roman"/>
-          <w:sz w:val="24"/>
-          <w:szCs w:val="24"/>
+        <w:pStyle w:val="ac"/>
+        <w:rPr>
+          <w:sz w:val="28"/>
+          <w:szCs w:val="28"/>
           <w:lang w:val="en-US"/>
         </w:rPr>
       </w:pPr>
       <w:r>
-        <w:rPr>
-          <w:rFonts w:ascii="Times New Roman" w:hAnsi="Times New Roman" w:cs="Times New Roman"/>
-          <w:sz w:val="24"/>
-          <w:szCs w:val="24"/>
+        <w:t xml:space="preserve">Рисунок </w:t>
+      </w:r>
+      <w:fldSimple w:instr=" SEQ Рисунок \* ARABIC ">
+        <w:r>
+          <w:rPr>
+            <w:noProof/>
+          </w:rPr>
+          <w:t>12</w:t>
+        </w:r>
+      </w:fldSimple>
+      <w:r>
+        <w:t>. Запуск анализа</w:t>
+      </w:r>
+    </w:p>
+    <w:p>
+      <w:pPr>
+        <w:keepNext/>
+        <w:tabs>
+          <w:tab w:val="left" w:pos="993"/>
+        </w:tabs>
+        <w:spacing w:line="360" w:lineRule="auto"/>
+        <w:jc w:val="center"/>
+      </w:pPr>
+      <w:r>
+        <w:rPr>
+          <w:rFonts w:ascii="Times New Roman" w:hAnsi="Times New Roman" w:cs="Times New Roman"/>
+          <w:noProof/>
+          <w:sz w:val="28"/>
+          <w:szCs w:val="28"/>
           <w:lang w:val="en-US"/>
         </w:rPr>
+        <w:lastRenderedPageBreak/>
         <w:drawing>
-          <wp:inline distT="0" distB="0" distL="0" distR="0" wp14:anchorId="46D3917D" wp14:editId="04192FB1">
-            <wp:extent cx="5940425" cy="3094355"/>
-            <wp:effectExtent l="0" t="0" r="3175" b="0"/>
+          <wp:inline distT="0" distB="0" distL="0" distR="0" wp14:anchorId="46D3917D" wp14:editId="4D58A3A9">
+            <wp:extent cx="5208905" cy="2713308"/>
+            <wp:effectExtent l="0" t="0" r="0" b="0"/>
             <wp:docPr id="939741111" name="Рисунок 1" descr="Изображение выглядит как текст, снимок экрана, программное обеспечение, компьютер&#10;&#10;Содержимое, созданное искусственным интеллектом, может быть неверным."/>
             <wp:cNvGraphicFramePr>
               <a:graphicFrameLocks xmlns:a="http://schemas.openxmlformats.org/drawingml/2006/main" noChangeAspect="1"/>
@@ -1401,7 +1427,7 @@
                   <pic:spPr>
                     <a:xfrm>
                       <a:off x="0" y="0"/>
-                      <a:ext cx="5940425" cy="3094355"/>
+                      <a:ext cx="5220165" cy="2719173"/>
                     </a:xfrm>
                     <a:prstGeom prst="rect">
                       <a:avLst/>
@@ -1416,63 +1442,82 @@
     </w:p>
     <w:p>
       <w:pPr>
+        <w:pStyle w:val="ac"/>
+        <w:rPr>
+          <w:sz w:val="28"/>
+          <w:szCs w:val="28"/>
+        </w:rPr>
+      </w:pPr>
+      <w:r>
+        <w:t xml:space="preserve">Рисунок </w:t>
+      </w:r>
+      <w:fldSimple w:instr=" SEQ Рисунок \* ARABIC ">
+        <w:r>
+          <w:rPr>
+            <w:noProof/>
+          </w:rPr>
+          <w:t>13</w:t>
+        </w:r>
+      </w:fldSimple>
+      <w:r>
+        <w:t>. Запуск «</w:t>
+      </w:r>
+      <w:r>
+        <w:rPr>
+          <w:lang w:val="en-US"/>
+        </w:rPr>
+        <w:t>Quick search</w:t>
+      </w:r>
+      <w:r>
+        <w:t>»</w:t>
+      </w:r>
+    </w:p>
+    <w:p>
+      <w:pPr>
         <w:numPr>
           <w:ilvl w:val="1"/>
           <w:numId w:val="5"/>
         </w:numPr>
+        <w:tabs>
+          <w:tab w:val="left" w:pos="993"/>
+        </w:tabs>
+        <w:spacing w:line="360" w:lineRule="auto"/>
+        <w:ind w:left="0" w:firstLine="709"/>
         <w:jc w:val="both"/>
         <w:rPr>
           <w:rFonts w:ascii="Times New Roman" w:hAnsi="Times New Roman" w:cs="Times New Roman"/>
+          <w:sz w:val="28"/>
+          <w:szCs w:val="28"/>
+        </w:rPr>
+      </w:pPr>
+      <w:r>
+        <w:rPr>
+          <w:rFonts w:ascii="Times New Roman" w:hAnsi="Times New Roman" w:cs="Times New Roman"/>
+          <w:sz w:val="28"/>
+          <w:szCs w:val="28"/>
+        </w:rPr>
+        <w:t>Если найден нужный раздел, выберите его и нажмите "Write", чтобы восстановить.</w:t>
+      </w:r>
+    </w:p>
+    <w:p>
+      <w:pPr>
+        <w:keepNext/>
+        <w:tabs>
+          <w:tab w:val="left" w:pos="993"/>
+        </w:tabs>
+        <w:spacing w:line="360" w:lineRule="auto"/>
+        <w:jc w:val="center"/>
+      </w:pPr>
+      <w:r>
+        <w:rPr>
+          <w:noProof/>
           <w:sz w:val="24"/>
           <w:szCs w:val="24"/>
         </w:rPr>
-      </w:pPr>
-      <w:r>
-        <w:rPr>
-          <w:rFonts w:ascii="Times New Roman" w:hAnsi="Times New Roman" w:cs="Times New Roman"/>
-          <w:sz w:val="24"/>
-          <w:szCs w:val="24"/>
-        </w:rPr>
-        <w:t>Если найден нужный раздел, выберите его и нажмите "</w:t>
-      </w:r>
-      <w:proofErr w:type="spellStart"/>
-      <w:r>
-        <w:rPr>
-          <w:rFonts w:ascii="Times New Roman" w:hAnsi="Times New Roman" w:cs="Times New Roman"/>
-          <w:sz w:val="24"/>
-          <w:szCs w:val="24"/>
-        </w:rPr>
-        <w:t>Write</w:t>
-      </w:r>
-      <w:proofErr w:type="spellEnd"/>
-      <w:r>
-        <w:rPr>
-          <w:rFonts w:ascii="Times New Roman" w:hAnsi="Times New Roman" w:cs="Times New Roman"/>
-          <w:sz w:val="24"/>
-          <w:szCs w:val="24"/>
-        </w:rPr>
-        <w:t>", чтобы восстановить.</w:t>
-      </w:r>
-    </w:p>
-    <w:p>
-      <w:pPr>
-        <w:ind w:left="1440"/>
-        <w:jc w:val="both"/>
-        <w:rPr>
-          <w:rFonts w:ascii="Times New Roman" w:hAnsi="Times New Roman" w:cs="Times New Roman"/>
-          <w:sz w:val="24"/>
-          <w:szCs w:val="24"/>
-        </w:rPr>
-      </w:pPr>
-      <w:r>
-        <w:rPr>
-          <w:noProof/>
-        </w:rPr>
-        <w:lastRenderedPageBreak/>
         <w:drawing>
-          <wp:inline distT="0" distB="0" distL="0" distR="0" wp14:anchorId="273553BE" wp14:editId="24F97975">
-            <wp:extent cx="4757579" cy="3056890"/>
-            <wp:effectExtent l="0" t="0" r="5080" b="0"/>
+          <wp:inline distT="0" distB="0" distL="0" distR="0" wp14:anchorId="273553BE" wp14:editId="24C8E440">
+            <wp:extent cx="4280341" cy="2750250"/>
+            <wp:effectExtent l="0" t="0" r="6350" b="0"/>
             <wp:docPr id="544897962" name="Рисунок 1" descr="Изображение выглядит как текст, электроника, снимок экрана, программное обеспечение&#10;&#10;Содержимое, созданное искусственным интеллектом, может быть неверным."/>
             <wp:cNvGraphicFramePr>
               <a:graphicFrameLocks xmlns:a="http://schemas.openxmlformats.org/drawingml/2006/main" noChangeAspect="1"/>
@@ -1496,7 +1541,7 @@
                   <pic:spPr bwMode="auto">
                     <a:xfrm>
                       <a:off x="0" y="0"/>
-                      <a:ext cx="4775497" cy="3068403"/>
+                      <a:ext cx="4299965" cy="2762859"/>
                     </a:xfrm>
                     <a:prstGeom prst="rect">
                       <a:avLst/>
@@ -1519,45 +1564,75 @@
     </w:p>
     <w:p>
       <w:pPr>
+        <w:pStyle w:val="ac"/>
+        <w:rPr>
+          <w:sz w:val="28"/>
+          <w:szCs w:val="28"/>
+        </w:rPr>
+      </w:pPr>
+      <w:r>
+        <w:t xml:space="preserve">Рисунок </w:t>
+      </w:r>
+      <w:fldSimple w:instr=" SEQ Рисунок \* ARABIC ">
+        <w:r>
+          <w:rPr>
+            <w:noProof/>
+          </w:rPr>
+          <w:t>14</w:t>
+        </w:r>
+      </w:fldSimple>
+      <w:r>
+        <w:t>. Восстановление</w:t>
+      </w:r>
+    </w:p>
+    <w:p>
+      <w:pPr>
         <w:numPr>
           <w:ilvl w:val="1"/>
           <w:numId w:val="5"/>
         </w:numPr>
+        <w:tabs>
+          <w:tab w:val="left" w:pos="993"/>
+        </w:tabs>
+        <w:spacing w:line="360" w:lineRule="auto"/>
+        <w:ind w:left="0" w:firstLine="709"/>
         <w:jc w:val="both"/>
         <w:rPr>
           <w:rFonts w:ascii="Times New Roman" w:hAnsi="Times New Roman" w:cs="Times New Roman"/>
-          <w:sz w:val="24"/>
-          <w:szCs w:val="24"/>
-        </w:rPr>
-      </w:pPr>
-      <w:r>
-        <w:rPr>
-          <w:rFonts w:ascii="Times New Roman" w:hAnsi="Times New Roman" w:cs="Times New Roman"/>
-          <w:sz w:val="24"/>
-          <w:szCs w:val="24"/>
+          <w:sz w:val="28"/>
+          <w:szCs w:val="28"/>
+        </w:rPr>
+      </w:pPr>
+      <w:r>
+        <w:rPr>
+          <w:rFonts w:ascii="Times New Roman" w:hAnsi="Times New Roman" w:cs="Times New Roman"/>
+          <w:sz w:val="28"/>
+          <w:szCs w:val="28"/>
         </w:rPr>
         <w:t>Перезагрузите систему и проверьте доступность данных.</w:t>
       </w:r>
     </w:p>
     <w:p>
       <w:pPr>
-        <w:jc w:val="both"/>
-        <w:rPr>
-          <w:rFonts w:ascii="Times New Roman" w:hAnsi="Times New Roman" w:cs="Times New Roman"/>
-          <w:sz w:val="24"/>
-          <w:szCs w:val="24"/>
-        </w:rPr>
-      </w:pPr>
-      <w:r>
-        <w:rPr>
-          <w:rFonts w:ascii="Times New Roman" w:hAnsi="Times New Roman" w:cs="Times New Roman"/>
-          <w:sz w:val="24"/>
-          <w:szCs w:val="24"/>
-        </w:rPr>
+        <w:keepNext/>
+        <w:tabs>
+          <w:tab w:val="left" w:pos="993"/>
+        </w:tabs>
+        <w:spacing w:line="360" w:lineRule="auto"/>
+        <w:jc w:val="center"/>
+      </w:pPr>
+      <w:r>
+        <w:rPr>
+          <w:rFonts w:ascii="Times New Roman" w:hAnsi="Times New Roman" w:cs="Times New Roman"/>
+          <w:noProof/>
+          <w:sz w:val="28"/>
+          <w:szCs w:val="28"/>
+        </w:rPr>
+        <w:lastRenderedPageBreak/>
         <w:drawing>
-          <wp:inline distT="0" distB="0" distL="0" distR="0" wp14:anchorId="5545B0B0" wp14:editId="1729CFBE">
-            <wp:extent cx="5940425" cy="4455160"/>
-            <wp:effectExtent l="0" t="0" r="3175" b="2540"/>
+          <wp:inline distT="0" distB="0" distL="0" distR="0" wp14:anchorId="5545B0B0" wp14:editId="09276A61">
+            <wp:extent cx="4827242" cy="3620302"/>
+            <wp:effectExtent l="0" t="0" r="0" b="0"/>
             <wp:docPr id="193581109" name="Рисунок 1" descr="Изображение выглядит как текст, снимок экрана, программное обеспечение, Значок на компьютере&#10;&#10;Содержимое, созданное искусственным интеллектом, может быть неверным."/>
             <wp:cNvGraphicFramePr>
               <a:graphicFrameLocks xmlns:a="http://schemas.openxmlformats.org/drawingml/2006/main" noChangeAspect="1"/>
@@ -1578,7 +1653,7 @@
                   <pic:spPr>
                     <a:xfrm>
                       <a:off x="0" y="0"/>
-                      <a:ext cx="5940425" cy="4455160"/>
+                      <a:ext cx="4831425" cy="3623439"/>
                     </a:xfrm>
                     <a:prstGeom prst="rect">
                       <a:avLst/>
@@ -1589,6 +1664,29 @@
             </a:graphic>
           </wp:inline>
         </w:drawing>
+      </w:r>
+    </w:p>
+    <w:p>
+      <w:pPr>
+        <w:pStyle w:val="ac"/>
+        <w:rPr>
+          <w:sz w:val="28"/>
+          <w:szCs w:val="28"/>
+        </w:rPr>
+      </w:pPr>
+      <w:r>
+        <w:t xml:space="preserve">Рисунок </w:t>
+      </w:r>
+      <w:fldSimple w:instr=" SEQ Рисунок \* ARABIC ">
+        <w:r>
+          <w:rPr>
+            <w:noProof/>
+          </w:rPr>
+          <w:t>15</w:t>
+        </w:r>
+      </w:fldSimple>
+      <w:r>
+        <w:t>. Данные востановлены</w:t>
       </w:r>
     </w:p>
     <w:sectPr>
@@ -3371,6 +3469,24 @@
       <w:spacing w:val="5"/>
     </w:rPr>
   </w:style>
+  <w:style w:type="paragraph" w:styleId="ac">
+    <w:name w:val="caption"/>
+    <w:basedOn w:val="a"/>
+    <w:next w:val="a"/>
+    <w:uiPriority w:val="35"/>
+    <w:unhideWhenUsed/>
+    <w:qFormat/>
+    <w:rsid w:val="00144179"/>
+    <w:pPr>
+      <w:spacing w:after="200" w:line="240" w:lineRule="auto"/>
+      <w:jc w:val="center"/>
+    </w:pPr>
+    <w:rPr>
+      <w:rFonts w:ascii="Times New Roman" w:hAnsi="Times New Roman" w:cs="Times New Roman"/>
+      <w:sz w:val="24"/>
+      <w:szCs w:val="24"/>
+    </w:rPr>
+  </w:style>
 </w:styles>
 </file>
 

</xml_diff>